<commit_message>
Update AWS DevOps courseware to v2
</commit_message>
<xml_diff>
--- a/courseware/LG-AWS Certified DevOps Engineer Professional Training.docx
+++ b/courseware/LG-AWS Certified DevOps Engineer Professional Training.docx
@@ -188,7 +188,7 @@
           <w:color w:val="111827"/>
           <w:sz w:val="24"/>
         </w:rPr>
-        <w:t>Version 1.0</w:t>
+        <w:t>Version 2.0</w:t>
       </w:r>
     </w:p>
     <w:p>
@@ -290,7 +290,7 @@
           </w:tcPr>
           <w:p>
             <w:r>
-              <w:t>1.0</w:t>
+              <w:t>2.0</w:t>
             </w:r>
           </w:p>
         </w:tc>
@@ -300,7 +300,7 @@
           </w:tcPr>
           <w:p>
             <w:r>
-              <w:t>10 Jul 2026</w:t>
+              <w:t>13 Jul 2026</w:t>
             </w:r>
           </w:p>
         </w:tc>
@@ -310,7 +310,7 @@
           </w:tcPr>
           <w:p>
             <w:r>
-              <w:t>Visual lab-aligned Learner Guide with detailed procedures and diagrams for all eight AWS DevOps labs.</w:t>
+              <w:t>Regenerated visual lab-aligned Learner Guide with detailed procedures and diagrams for all eight AWS DevOps labs.</w:t>
             </w:r>
           </w:p>
         </w:tc>

</xml_diff>